<commit_message>
Menambah copy simulasi menambahkan artifact ke server SIT
</commit_message>
<xml_diff>
--- a/Research Document CICD Pipeline for Enterprise Application Deployment.docx
+++ b/Research Document CICD Pipeline for Enterprise Application Deployment.docx
@@ -5804,51 +5804,6 @@
         </w:rPr>
         <w:t xml:space="preserve"> </w:t>
       </w:r>
-      <w:r>
-        <w:rPr>
-          <w:color w:val="C00000"/>
-        </w:rPr>
-        <w:t>Mahasiswa</w:t>
-      </w:r>
-      <w:r>
-        <w:rPr>
-          <w:color w:val="C00000"/>
-          <w:spacing w:val="-3"/>
-        </w:rPr>
-        <w:t xml:space="preserve"> </w:t>
-      </w:r>
-      <w:r>
-        <w:rPr>
-          <w:color w:val="C00000"/>
-        </w:rPr>
-        <w:t>magang</w:t>
-      </w:r>
-      <w:r>
-        <w:rPr>
-          <w:color w:val="C00000"/>
-          <w:spacing w:val="-3"/>
-        </w:rPr>
-        <w:t xml:space="preserve"> </w:t>
-      </w:r>
-      <w:r>
-        <w:rPr>
-          <w:color w:val="C00000"/>
-        </w:rPr>
-        <w:t>pada posisi QA Tester berperan langsung dalam identifikasi bug serta memastikan aplikasi website internal, website production, dan aplikasi mobile (iOS/Android) terjamin stabilitas dan keandalannya sebelum dirilis kepada nasabah sebuah langkah penting</w:t>
-      </w:r>
-      <w:r>
-        <w:rPr>
-          <w:color w:val="C00000"/>
-          <w:spacing w:val="40"/>
-        </w:rPr>
-        <w:t xml:space="preserve"> </w:t>
-      </w:r>
-      <w:r>
-        <w:rPr>
-          <w:color w:val="C00000"/>
-        </w:rPr>
-        <w:t>yang turut menjaga reputasi serta risiko finansial perusahaan.</w:t>
-      </w:r>
     </w:p>
     <w:p>
       <w:pPr>
@@ -5938,6 +5893,9 @@
       </w:r>
       <w:r>
         <w:t>riset fokus pada</w:t>
+      </w:r>
+      <w:r>
+        <w:t xml:space="preserve"> sisi Devops(Developer </w:t>
       </w:r>
     </w:p>
     <w:p>
@@ -5953,6 +5911,9 @@
           <w:cols w:space="720"/>
         </w:sectPr>
       </w:pPr>
+      <w:r>
+        <w:t xml:space="preserve"> </w:t>
+      </w:r>
     </w:p>
     <w:p>
       <w:pPr>
@@ -6356,7 +6317,13 @@
                             <w:rPr>
                               <w:spacing w:val="-5"/>
                             </w:rPr>
-                            <w:t>11</w:t>
+                            <w:t>1</w:t>
+                          </w:r>
+                          <w:r>
+                            <w:rPr>
+                              <w:spacing w:val="-5"/>
+                            </w:rPr>
+                            <w:t>1</w:t>
                           </w:r>
                           <w:r>
                             <w:rPr>

</xml_diff>